<commit_message>
docs: update progress report 1 with repository details
</commit_message>
<xml_diff>
--- a/docs/reports/SDS-02_Progress_Report_1_MediTrace.docx
+++ b/docs/reports/SDS-02_Progress_Report_1_MediTrace.docx
@@ -429,9 +429,8 @@
               <w:rPr>
                 <w:rFonts w:ascii="Calibri" w:hAnsi="Calibri" w:cs="Calibri"/>
                 <w:sz w:val="20"/>
-                <w:highlight w:val="yellow"/>
-              </w:rPr>
-              <w:t xml:space="preserve">[Repository URL]</w:t>
+              </w:rPr>
+              <w:t xml:space="preserve">https://github.com/Akiren7/SEN0421-meditrace</w:t>
             </w:r>
           </w:p>
         </w:tc>
@@ -1855,9 +1854,8 @@
                 <w:rFonts w:ascii="Calibri" w:hAnsi="Calibri" w:cs="Calibri"/>
                 <w:color w:val="282828"/>
                 <w:sz w:val="18"/>
-                <w:highlight w:val="yellow"/>
-              </w:rPr>
-              <w:t xml:space="preserve">[Repo URL / initial commit ID]</w:t>
+              </w:rPr>
+              <w:t xml:space="preserve">Commits b239317, 74afaa3, ff34428 (github.com/Akiren7/SEN0421-meditrace)</w:t>
             </w:r>
           </w:p>
         </w:tc>

</xml_diff>